<commit_message>
Fix Selections & Allowances end-to-end: packet auth, BoldSign merge/signature tags across 3 templates, missing UI (Add Allowance, Add Choice, mid-job creation), combined quote-stage signing flow, deposit/conversion crash, documents visibility (portal + owner dashboard)
</commit_message>
<xml_diff>
--- a/src/templates/prepped/service-agreement.docx
+++ b/src/templates/prepped/service-agreement.docx
@@ -646,7 +646,7 @@
                 <w:sz w:val="20"/>
                 <w:szCs w:val="20"/>
               </w:rPr>
-              <w:t xml:space="preserve">$</w:t>
+              <w:t xml:space="preserve">${{payment_1_amount}}</w:t>
             </w:r>
           </w:p>
         </w:tc>
@@ -676,7 +676,7 @@
                 <w:sz w:val="20"/>
                 <w:szCs w:val="20"/>
               </w:rPr>
-              <w:t xml:space="preserve"/>
+              <w:t xml:space="preserve">{{payment_1_due}}</w:t>
             </w:r>
           </w:p>
         </w:tc>
@@ -738,7 +738,7 @@
                 <w:sz w:val="20"/>
                 <w:szCs w:val="20"/>
               </w:rPr>
-              <w:t xml:space="preserve">$</w:t>
+              <w:t xml:space="preserve">${{payment_2_amount}}</w:t>
             </w:r>
           </w:p>
         </w:tc>
@@ -768,7 +768,7 @@
                 <w:sz w:val="20"/>
                 <w:szCs w:val="20"/>
               </w:rPr>
-              <w:t xml:space="preserve"/>
+              <w:t xml:space="preserve">{{payment_2_due}}</w:t>
             </w:r>
           </w:p>
         </w:tc>
@@ -830,7 +830,7 @@
                 <w:sz w:val="20"/>
                 <w:szCs w:val="20"/>
               </w:rPr>
-              <w:t xml:space="preserve">$</w:t>
+              <w:t xml:space="preserve">${{payment_3_amount}}</w:t>
             </w:r>
           </w:p>
         </w:tc>
@@ -860,7 +860,7 @@
                 <w:sz w:val="20"/>
                 <w:szCs w:val="20"/>
               </w:rPr>
-              <w:t xml:space="preserve"/>
+              <w:t xml:space="preserve">{{payment_3_due}}</w:t>
             </w:r>
           </w:p>
         </w:tc>
@@ -1504,10 +1504,11 @@
             </w:pPr>
             <w:r>
               <w:rPr>
-                <w:sz w:val="28"/>
-                <w:szCs w:val="28"/>
-              </w:rPr>
-              <w:t xml:space="preserve"/>
+                <w:sz w:val="24"/>
+                <w:szCs w:val="24"/>
+                <w:color w:val="CCCCCC"/>
+              </w:rPr>
+              <w:t xml:space="preserve">{{sign|1|*| |client_sig}}</w:t>
             </w:r>
           </w:p>
         </w:tc>
@@ -1655,7 +1656,7 @@
                 <w:sz w:val="28"/>
                 <w:szCs w:val="28"/>
               </w:rPr>
-              <w:t xml:space="preserve"/>
+              <w:t xml:space="preserve">{{client_name}}</w:t>
             </w:r>
           </w:p>
         </w:tc>
@@ -1798,10 +1799,11 @@
             </w:pPr>
             <w:r>
               <w:rPr>
-                <w:sz w:val="28"/>
-                <w:szCs w:val="28"/>
-              </w:rPr>
-              <w:t xml:space="preserve"/>
+                <w:sz w:val="24"/>
+                <w:szCs w:val="24"/>
+                <w:color w:val="CCCCCC"/>
+              </w:rPr>
+              <w:t xml:space="preserve">{{date|1|*| |client_date}}</w:t>
             </w:r>
           </w:p>
         </w:tc>

</xml_diff>